<commit_message>
Alinear Jornadas IA al documento maestro: artículo científico de 2.000 palabras.
Actualiza instructivo general, instructivo y plantilla Word del artículo, textos de la web y referencias en el instructivo de presentación.

Co-authored-by: Cursor <cursoragent@cursor.com>
</commit_message>
<xml_diff>
--- a/docs/plantillas/plantilla-resumen-jornadas-ia-2026.docx
+++ b/docs/plantillas/plantilla-resumen-jornadas-ia-2026.docx
@@ -121,7 +121,7 @@
                 <w:color w:val="FFFFFF"/>
                 <w:sz w:val="18"/>
               </w:rPr>
-              <w:t>Plantilla de resumen · Encuentro virtual · 6 de octubre de 2026 · 15:00 h</w:t>
+              <w:t>Plantilla de artículo científico · 2.000 palabras · 6 de octubre de 2026</w:t>
             </w:r>
           </w:p>
         </w:tc>
@@ -179,7 +179,7 @@
           <w:color w:val="5C4F54"/>
           <w:sz w:val="18"/>
         </w:rPr>
-        <w:t>INSTRUCCIONES (borrar este párrafo al enviar): Arial 10 pt, interlineado sencillo, máximo 250 palabras en el cuerpo del resumen. Sin cuadros, gráficos ni bibliografía. Subrayá al autor que presentará. Nombre del archivo: Area_Universidad_Apellido_Titulo.docx</w:t>
+        <w:t>INSTRUCCIONES (borrar este párrafo al enviar): Artículo científico de aproximadamente 2.000 palabras para la Revista Cuadernos. Completá título, autores, unidad y cuerpo. Nombre del archivo: Area_Universidad_Apellido_Titulo.docx. Cierre de carga: 10 de septiembre de 2026.</w:t>
       </w:r>
     </w:p>
     <w:p>
@@ -254,7 +254,7 @@
           <w:i w:val="0"/>
           <w:sz w:val="20"/>
         </w:rPr>
-        <w:t>Texto del resumen</w:t>
+        <w:t>Texto del artículo científico (aprox. 2.000 palabras)</w:t>
       </w:r>
     </w:p>
     <w:p>
@@ -279,7 +279,7 @@
           <w:color w:val="5C4F54"/>
           <w:sz w:val="20"/>
         </w:rPr>
-        <w:t>Breve contexto y objetivo del trabajo. [reemplazar este texto]</w:t>
+        <w:t>Contexto, problema y objetivos del trabajo. [reemplazar este texto]</w:t>
       </w:r>
     </w:p>
     <w:p>
@@ -294,7 +294,32 @@
           <w:i w:val="0"/>
           <w:sz w:val="20"/>
         </w:rPr>
-        <w:t xml:space="preserve">Metodología. </w:t>
+        <w:t xml:space="preserve">Marco / antecedentes. </w:t>
+      </w:r>
+      <w:r>
+        <w:rPr>
+          <w:rFonts w:ascii="Arial" w:hAnsi="Arial" w:eastAsia="Arial"/>
+          <w:b w:val="0"/>
+          <w:i/>
+          <w:color w:val="5C4F54"/>
+          <w:sz w:val="20"/>
+        </w:rPr>
+        <w:t>Si corresponde, según el eje temático. [reemplazar este texto]</w:t>
+      </w:r>
+    </w:p>
+    <w:p>
+      <w:pPr>
+        <w:spacing w:after="160" w:line="240" w:lineRule="auto"/>
+        <w:jc w:val="both"/>
+      </w:pPr>
+      <w:r>
+        <w:rPr>
+          <w:rFonts w:ascii="Arial" w:hAnsi="Arial" w:eastAsia="Arial"/>
+          <w:b/>
+          <w:i w:val="0"/>
+          <w:sz w:val="20"/>
+        </w:rPr>
+        <w:t xml:space="preserve">Metodología o experiencia. </w:t>
       </w:r>
       <w:r>
         <w:rPr>
@@ -319,7 +344,7 @@
           <w:i w:val="0"/>
           <w:sz w:val="20"/>
         </w:rPr>
-        <w:t xml:space="preserve">Resultados. </w:t>
+        <w:t xml:space="preserve">Resultados / hallazgos. </w:t>
       </w:r>
       <w:r>
         <w:rPr>
@@ -329,7 +354,7 @@
           <w:color w:val="5C4F54"/>
           <w:sz w:val="20"/>
         </w:rPr>
-        <w:t>Hallazgos principales, de forma concisa. [reemplazar este texto]</w:t>
+        <w:t>Principales aportes, de forma clara. [reemplazar este texto]</w:t>
       </w:r>
     </w:p>
     <w:p>
@@ -344,7 +369,7 @@
           <w:i w:val="0"/>
           <w:sz w:val="20"/>
         </w:rPr>
-        <w:t xml:space="preserve">Conclusiones. </w:t>
+        <w:t xml:space="preserve">Discusión y conclusiones. </w:t>
       </w:r>
       <w:r>
         <w:rPr>
@@ -354,7 +379,32 @@
           <w:color w:val="5C4F54"/>
           <w:sz w:val="20"/>
         </w:rPr>
-        <w:t>Mensaje clave e implicancias. [reemplazar este texto]</w:t>
+        <w:t>Implicancias y cierre. [reemplazar este texto]</w:t>
+      </w:r>
+    </w:p>
+    <w:p>
+      <w:pPr>
+        <w:spacing w:after="160" w:line="240" w:lineRule="auto"/>
+        <w:jc w:val="both"/>
+      </w:pPr>
+      <w:r>
+        <w:rPr>
+          <w:rFonts w:ascii="Arial" w:hAnsi="Arial" w:eastAsia="Arial"/>
+          <w:b/>
+          <w:i w:val="0"/>
+          <w:sz w:val="20"/>
+        </w:rPr>
+        <w:t xml:space="preserve">Referencias. </w:t>
+      </w:r>
+      <w:r>
+        <w:rPr>
+          <w:rFonts w:ascii="Arial" w:hAnsi="Arial" w:eastAsia="Arial"/>
+          <w:b w:val="0"/>
+          <w:i/>
+          <w:color w:val="5C4F54"/>
+          <w:sz w:val="20"/>
+        </w:rPr>
+        <w:t>Según normativa editorial de la Revista Cuadernos. [reemplazar este texto]</w:t>
       </w:r>
     </w:p>
     <w:p>
@@ -370,7 +420,7 @@
           <w:color w:val="5C4F54"/>
           <w:sz w:val="18"/>
         </w:rPr>
-        <w:t>Cierre de carga: 10 de septiembre de 2026 · Observatorio de IA — https://claudiomlarrea.github.io/observatorio-ia/#jornadas-ia</w:t>
+        <w:t>Artículo de 2.000 palabras · Cierre: 10 de septiembre de 2026 · Observatorio de IA — https://claudiomlarrea.github.io/observatorio-ia/#jornadas-ia</w:t>
       </w:r>
     </w:p>
     <w:sectPr>

</xml_diff>

<commit_message>
Prorrogar la carga de artículos y PPT al 16 de septiembre.
Actualiza sitio, flayer, instructivos, plantillas y notas del programa.

Co-authored-by: Cursor <cursoragent@cursor.com>
</commit_message>
<xml_diff>
--- a/docs/plantillas/plantilla-resumen-jornadas-ia-2026.docx
+++ b/docs/plantillas/plantilla-resumen-jornadas-ia-2026.docx
@@ -179,7 +179,7 @@
           <w:color w:val="5C4F54"/>
           <w:sz w:val="18"/>
         </w:rPr>
-        <w:t>INSTRUCCIONES (borrar este párrafo al enviar): Artículo científico de aproximadamente 2.000 palabras para la Revista Cuadernos. Completá título, autores, unidad y cuerpo. Nombre del archivo: Area_Universidad_Apellido_Titulo.docx. Cierre de carga: 10 de septiembre de 2026.</w:t>
+        <w:t>INSTRUCCIONES (borrar este párrafo al enviar): Artículo científico de aproximadamente 2.000 palabras para la Revista Cuadernos. Completá título, autores, unidad y cuerpo. Nombre del archivo: Area_Universidad_Apellido_Titulo.docx. Cierre de carga: 16 de septiembre de 2026.</w:t>
       </w:r>
     </w:p>
     <w:p>
@@ -420,7 +420,7 @@
           <w:color w:val="5C4F54"/>
           <w:sz w:val="18"/>
         </w:rPr>
-        <w:t>Artículo de 2.000 palabras · Cierre: 10 de septiembre de 2026 · Observatorio de IA — https://claudiomlarrea.github.io/observatorio-ia/#jornadas-ia</w:t>
+        <w:t>Artículo de 2.000 palabras · Cierre: 16 de septiembre de 2026 · Observatorio de IA — https://claudiomlarrea.github.io/observatorio-ia/#jornadas-ia</w:t>
       </w:r>
     </w:p>
     <w:sectPr>

</xml_diff>